<commit_message>
docs: añadir frameworks complementarios completos en resumen ejecutivo
- ISO/IEC 38507:2022 (Gobernanza TI para IA)
- OECD AI Principles
- ICO UK Guidance
- IEEE Ethically Aligned Design

Ahora refleja cobertura completa de 6 frameworks de cumplimiento integrados
</commit_message>
<xml_diff>
--- a/docs/lanzamiento/RESUMEN_EJECUTIVO_COMPLIANCE_PROFESIONAL.docx
+++ b/docs/lanzamiento/RESUMEN_EJECUTIVO_COMPLIANCE_PROFESIONAL.docx
@@ -368,50 +368,120 @@
     </w:p>
     <w:p>
       <w:pPr>
-        <w:numPr>
-          <w:ilvl w:val="0"/>
-          <w:numId w:val="1001"/>
-        </w:numPr>
-        <w:pStyle w:val="Compact"/>
-      </w:pPr>
-      <w:r>
-        <w:t xml:space="preserve">Reglamento (UE) 2016/679 (RGPD): Integración completa</w:t>
-      </w:r>
-    </w:p>
-    <w:p>
-      <w:pPr>
-        <w:numPr>
-          <w:ilvl w:val="0"/>
-          <w:numId w:val="1001"/>
-        </w:numPr>
-        <w:pStyle w:val="Compact"/>
-      </w:pPr>
-      <w:r>
-        <w:t xml:space="preserve">ISO/IEC 42001:2023: Sistema de gestión de IA</w:t>
-      </w:r>
-    </w:p>
-    <w:p>
-      <w:pPr>
-        <w:numPr>
-          <w:ilvl w:val="0"/>
-          <w:numId w:val="1001"/>
-        </w:numPr>
-        <w:pStyle w:val="Compact"/>
-      </w:pPr>
-      <w:r>
-        <w:t xml:space="preserve">ISO/IEC 23894:2023: Gestión de riesgos de IA</w:t>
-      </w:r>
-    </w:p>
-    <w:p>
-      <w:pPr>
-        <w:numPr>
-          <w:ilvl w:val="0"/>
-          <w:numId w:val="1001"/>
-        </w:numPr>
-        <w:pStyle w:val="Compact"/>
-      </w:pPr>
-      <w:r>
-        <w:t xml:space="preserve">Directiva (UE) 2019/790: Derechos de autor (Art. 53.1.c)</w:t>
+        <w:pStyle w:val="FirstParagraph"/>
+      </w:pPr>
+      <w:r>
+        <w:rPr>
+          <w:bCs/>
+          <w:b/>
+        </w:rPr>
+        <w:t xml:space="preserve">Normativa Europea:</w:t>
+      </w:r>
+      <w:r>
+        <w:t xml:space="preserve"> </w:t>
+      </w:r>
+      <w:r>
+        <w:t xml:space="preserve">- Reglamento (UE) 2016/679 (RGPD): Integración completa</w:t>
+      </w:r>
+      <w:r>
+        <w:t xml:space="preserve"> </w:t>
+      </w:r>
+      <w:r>
+        <w:t xml:space="preserve">- Directiva (UE) 2019/790: Derechos de autor (Art. 53.1.c GPAI)</w:t>
+      </w:r>
+    </w:p>
+    <w:p>
+      <w:pPr>
+        <w:pStyle w:val="BodyText"/>
+      </w:pPr>
+      <w:r>
+        <w:rPr>
+          <w:bCs/>
+          <w:b/>
+        </w:rPr>
+        <w:t xml:space="preserve">Estándares Internacionales ISO:</w:t>
+      </w:r>
+      <w:r>
+        <w:t xml:space="preserve"> </w:t>
+      </w:r>
+      <w:r>
+        <w:t xml:space="preserve">- ISO/IEC 42001:2023: Sistema de gestión de IA</w:t>
+      </w:r>
+      <w:r>
+        <w:t xml:space="preserve"> </w:t>
+      </w:r>
+      <w:r>
+        <w:t xml:space="preserve">- ISO/IEC 38507:2022: Gobernanza de TI para uso de IA en organizaciones</w:t>
+      </w:r>
+      <w:r>
+        <w:t xml:space="preserve"> </w:t>
+      </w:r>
+      <w:r>
+        <w:t xml:space="preserve">- ISO/IEC 23894:2023: Gestión de riesgos de IA</w:t>
+      </w:r>
+    </w:p>
+    <w:p>
+      <w:pPr>
+        <w:pStyle w:val="BodyText"/>
+      </w:pPr>
+      <w:r>
+        <w:rPr>
+          <w:bCs/>
+          <w:b/>
+        </w:rPr>
+        <w:t xml:space="preserve">Marcos de Referencia Complementarios:</w:t>
+      </w:r>
+      <w:r>
+        <w:t xml:space="preserve"> </w:t>
+      </w:r>
+      <w:r>
+        <w:t xml:space="preserve">- OECD AI Principles: IA innovadora, confiable y ética</w:t>
+      </w:r>
+      <w:r>
+        <w:t xml:space="preserve"> </w:t>
+      </w:r>
+      <w:r>
+        <w:t xml:space="preserve">- ICO UK Guidance: Transparencia, accountability y protección de datos en IA</w:t>
+      </w:r>
+      <w:r>
+        <w:t xml:space="preserve"> </w:t>
+      </w:r>
+      <w:r>
+        <w:t xml:space="preserve">- IEEE Ethically Aligned Design (EAD): Diseño alineado con valores humanos</w:t>
+      </w:r>
+    </w:p>
+    <w:p>
+      <w:pPr>
+        <w:pStyle w:val="BodyText"/>
+      </w:pPr>
+      <w:r>
+        <w:rPr>
+          <w:bCs/>
+          <w:b/>
+        </w:rPr>
+        <w:t xml:space="preserve">Cobertura:</w:t>
+      </w:r>
+      <w:r>
+        <w:t xml:space="preserve"> </w:t>
+      </w:r>
+      <w:r>
+        <w:t xml:space="preserve">CodeflowX implementa requisitos de</w:t>
+      </w:r>
+      <w:r>
+        <w:t xml:space="preserve"> </w:t>
+      </w:r>
+      <w:r>
+        <w:rPr>
+          <w:bCs/>
+          <w:b/>
+        </w:rPr>
+        <w:t xml:space="preserve">6 frameworks de cumplimiento</w:t>
+      </w:r>
+      <w:r>
+        <w:t xml:space="preserve"> </w:t>
+      </w:r>
+      <w:r>
+        <w:t xml:space="preserve">de forma integrada, no como herramientas aisladas</w:t>
       </w:r>
     </w:p>
     <w:p>
@@ -1641,7 +1711,7 @@
       <w:pPr>
         <w:numPr>
           <w:ilvl w:val="0"/>
-          <w:numId w:val="1002"/>
+          <w:numId w:val="1001"/>
         </w:numPr>
         <w:pStyle w:val="Compact"/>
       </w:pPr>
@@ -1663,7 +1733,7 @@
       <w:pPr>
         <w:numPr>
           <w:ilvl w:val="0"/>
-          <w:numId w:val="1002"/>
+          <w:numId w:val="1001"/>
         </w:numPr>
         <w:pStyle w:val="Compact"/>
       </w:pPr>
@@ -2489,82 +2559,6 @@
       </w:pPr>
     </w:lvl>
   </w:abstractNum>
-  <w:abstractNum w:abstractNumId="991">
-    <w:nsid w:val="A991"/>
-    <w:multiLevelType w:val="multilevel"/>
-    <w:lvl w:ilvl="0">
-      <w:numFmt w:val="bullet"/>
-      <w:lvlText w:val="•"/>
-      <w:lvlJc w:val="left"/>
-      <w:pPr>
-        <w:ind w:left="720" w:hanging="480"/>
-      </w:pPr>
-    </w:lvl>
-    <w:lvl w:ilvl="1">
-      <w:numFmt w:val="bullet"/>
-      <w:lvlText w:val="–"/>
-      <w:lvlJc w:val="left"/>
-      <w:pPr>
-        <w:ind w:left="1440" w:hanging="480"/>
-      </w:pPr>
-    </w:lvl>
-    <w:lvl w:ilvl="2">
-      <w:numFmt w:val="bullet"/>
-      <w:lvlText w:val="•"/>
-      <w:lvlJc w:val="left"/>
-      <w:pPr>
-        <w:ind w:left="2160" w:hanging="480"/>
-      </w:pPr>
-    </w:lvl>
-    <w:lvl w:ilvl="3">
-      <w:numFmt w:val="bullet"/>
-      <w:lvlText w:val="–"/>
-      <w:lvlJc w:val="left"/>
-      <w:pPr>
-        <w:ind w:left="2880" w:hanging="480"/>
-      </w:pPr>
-    </w:lvl>
-    <w:lvl w:ilvl="4">
-      <w:numFmt w:val="bullet"/>
-      <w:lvlText w:val="•"/>
-      <w:lvlJc w:val="left"/>
-      <w:pPr>
-        <w:ind w:left="3600" w:hanging="480"/>
-      </w:pPr>
-    </w:lvl>
-    <w:lvl w:ilvl="5">
-      <w:numFmt w:val="bullet"/>
-      <w:lvlText w:val="–"/>
-      <w:lvlJc w:val="left"/>
-      <w:pPr>
-        <w:ind w:left="4320" w:hanging="480"/>
-      </w:pPr>
-    </w:lvl>
-    <w:lvl w:ilvl="6">
-      <w:numFmt w:val="bullet"/>
-      <w:lvlText w:val="•"/>
-      <w:lvlJc w:val="left"/>
-      <w:pPr>
-        <w:ind w:left="5040" w:hanging="480"/>
-      </w:pPr>
-    </w:lvl>
-    <w:lvl w:ilvl="7">
-      <w:numFmt w:val="bullet"/>
-      <w:lvlText w:val="–"/>
-      <w:lvlJc w:val="left"/>
-      <w:pPr>
-        <w:ind w:left="5760" w:hanging="480"/>
-      </w:pPr>
-    </w:lvl>
-    <w:lvl w:ilvl="8">
-      <w:numFmt w:val="bullet"/>
-      <w:lvlText w:val="•"/>
-      <w:lvlJc w:val="left"/>
-      <w:pPr>
-        <w:ind w:left="6480" w:hanging="480"/>
-      </w:pPr>
-    </w:lvl>
-  </w:abstractNum>
   <w:abstractNum w:abstractNumId="99411">
     <w:nsid w:val="A99411"/>
     <w:multiLevelType w:val="multilevel"/>
@@ -2654,9 +2648,6 @@
     <w:abstractNumId w:val="990"/>
   </w:num>
   <w:num w:numId="1001">
-    <w:abstractNumId w:val="991"/>
-  </w:num>
-  <w:num w:numId="1002">
     <w:abstractNumId w:val="99411"/>
     <w:lvlOverride w:ilvl="0">
       <w:startOverride w:val="1"/>

</xml_diff>